<commit_message>
Remove institutional branding from suite
</commit_message>
<xml_diff>
--- a/teaching.docs/CoreLoading_Simulator_Possible_Student_Exercises.docx
+++ b/teaching.docs/CoreLoading_Simulator_Possible_Student_Exercises.docx
@@ -8,40 +8,7 @@
         <w:jc w:val="right"/>
         <w:widowControl/>
       </w:pPr>
-      <w:r>
-        <w:drawing>
-          <wp:inline xmlns:a="http://schemas.openxmlformats.org/drawingml/2006/main" xmlns:pic="http://schemas.openxmlformats.org/drawingml/2006/picture">
-            <wp:extent cx="3474720" cy="1161444"/>
-            <wp:docPr id="1" name="Picture 1"/>
-            <wp:cNvGraphicFramePr>
-              <a:graphicFrameLocks noChangeAspect="1"/>
-            </wp:cNvGraphicFramePr>
-            <a:graphic>
-              <a:graphicData uri="http://schemas.openxmlformats.org/drawingml/2006/picture">
-                <pic:pic>
-                  <pic:nvPicPr>
-                    <pic:cNvPr id="0" name="UTM.logo.png"/>
-                    <pic:cNvPicPr/>
-                  </pic:nvPicPr>
-                  <pic:blipFill>
-                    <a:blip r:embed="rId11"/>
-                    <a:stretch>
-                      <a:fillRect/>
-                    </a:stretch>
-                  </pic:blipFill>
-                  <pic:spPr>
-                    <a:xfrm>
-                      <a:off x="0" y="0"/>
-                      <a:ext cx="3474720" cy="1161444"/>
-                    </a:xfrm>
-                    <a:prstGeom prst="rect"/>
-                  </pic:spPr>
-                </pic:pic>
-              </a:graphicData>
-            </a:graphic>
-          </wp:inline>
-        </w:drawing>
-      </w:r>
+      <w:r/>
     </w:p>
     <w:p>
       <w:pPr>
@@ -144,7 +111,7 @@
           <w:color w:val="1F2933"/>
           <w:sz w:val="20"/>
         </w:rPr>
-        <w:t>Universiti Teknologi Malaysia</w:t>
+        <w:t/>
       </w:r>
     </w:p>
     <w:tbl>
@@ -8629,7 +8596,7 @@
         <w:color w:val="53606C"/>
         <w:sz w:val="16"/>
       </w:rPr>
-      <w:t xml:space="preserve">Universiti Teknologi Malaysia  |  Educational teaching material   |   Page </w:t>
+      <w:t xml:space="preserve">  |  Educational teaching material   |   Page </w:t>
     </w:r>
     <w:r>
       <w:fldChar w:fldCharType="begin"/>

</xml_diff>